<commit_message>
Added backend functionss for ading/getting workouts. Need to do one for editing workout
</commit_message>
<xml_diff>
--- a/ProgressLog.docx
+++ b/ProgressLog.docx
@@ -196,10 +196,7 @@
         </w:numPr>
       </w:pPr>
       <w:r>
-        <w:t>Backend follows a controller/service/route architecture</w:t>
-      </w:r>
-      <w:r>
-        <w:t xml:space="preserve">. The route calls the controller, which handles the input </w:t>
+        <w:t xml:space="preserve">Backend follows a controller/service/route architecture. The route calls the controller, which handles the input </w:t>
       </w:r>
       <w:proofErr w:type="spellStart"/>
       <w:r>

</xml_diff>

<commit_message>
Updated log. Added centralized error handling and updated workout endpoints a bit (WIP)
</commit_message>
<xml_diff>
--- a/ProgressLog.docx
+++ b/ProgressLog.docx
@@ -21,26 +21,10 @@
     </w:p>
     <w:p>
       <w:r>
-        <w:t xml:space="preserve">I started this log to track notes on where I left off, what I have left to do, and how my app works. I will update this document as I go along building my app so I can document this progress and keep myself accountable. This might not be the most organized document, but I will start with taking notes on my app so with rising grad </w:t>
-      </w:r>
-      <w:proofErr w:type="gramStart"/>
-      <w:r>
-        <w:t>school work</w:t>
-      </w:r>
-      <w:proofErr w:type="gramEnd"/>
-      <w:r>
-        <w:t xml:space="preserve">, I can come back and hit the ground running without a lot of re-learning my </w:t>
-      </w:r>
-      <w:r>
-        <w:t xml:space="preserve">app. For this </w:t>
-      </w:r>
-      <w:proofErr w:type="gramStart"/>
-      <w:r>
-        <w:t>reason</w:t>
-      </w:r>
-      <w:proofErr w:type="gramEnd"/>
-      <w:r>
-        <w:t xml:space="preserve"> each progress week might not be linear/contiguous, but slow and steady wins the race.</w:t>
+        <w:t xml:space="preserve">I started this log to track notes on where I left off, what I have left to do, and how my app works. I will update this document as I go along building my app so I can document this progress and keep myself accountable. This might not be the most organized document, but I will start with taking notes on my app so with rising grad school work, I can come back and hit the ground running without a lot of re-learning my </w:t>
+      </w:r>
+      <w:r>
+        <w:t>app. For this reason each progress week might not be linear/contiguous, but slow and steady wins the race.</w:t>
       </w:r>
     </w:p>
     <w:p>
@@ -48,17 +32,7 @@
         <w:pStyle w:val="Heading1"/>
       </w:pPr>
       <w:r>
-        <w:t xml:space="preserve">Notes on how this works, since </w:t>
-      </w:r>
-      <w:proofErr w:type="spellStart"/>
-      <w:proofErr w:type="gramStart"/>
-      <w:r>
-        <w:t>its</w:t>
-      </w:r>
-      <w:proofErr w:type="spellEnd"/>
-      <w:proofErr w:type="gramEnd"/>
-      <w:r>
-        <w:t xml:space="preserve"> been a while</w:t>
+        <w:t>Notes on how this works, since its been a while</w:t>
       </w:r>
     </w:p>
     <w:p>
@@ -70,21 +44,8 @@
         </w:numPr>
       </w:pPr>
       <w:r>
-        <w:t>All frontend logic auth is handled via utils/</w:t>
-      </w:r>
-      <w:proofErr w:type="spellStart"/>
-      <w:r>
-        <w:t>AuthProvider</w:t>
-      </w:r>
-      <w:proofErr w:type="spellEnd"/>
-      <w:r>
-        <w:t xml:space="preserve"> and utils/</w:t>
-      </w:r>
-      <w:proofErr w:type="spellStart"/>
-      <w:r>
-        <w:t>AxiosInterceptorHandler</w:t>
-      </w:r>
-      <w:proofErr w:type="spellEnd"/>
+        <w:t>All frontend logic auth is handled via utils/AuthProvider and utils/AxiosInterceptorHandler</w:t>
+      </w:r>
     </w:p>
     <w:p>
       <w:pPr>
@@ -94,21 +55,8 @@
           <w:numId w:val="3"/>
         </w:numPr>
       </w:pPr>
-      <w:proofErr w:type="spellStart"/>
-      <w:r>
-        <w:t>AuthProvider</w:t>
-      </w:r>
-      <w:proofErr w:type="spellEnd"/>
-      <w:r>
-        <w:t xml:space="preserve"> wraps our entire app and returns </w:t>
-      </w:r>
-      <w:proofErr w:type="spellStart"/>
-      <w:r>
-        <w:t>loggedIn</w:t>
-      </w:r>
-      <w:proofErr w:type="spellEnd"/>
-      <w:r>
-        <w:t xml:space="preserve"> state value prop so our entire app can access it globally (via prop drilling technically)</w:t>
+      <w:r>
+        <w:t>AuthProvider wraps our entire app and returns loggedIn state value prop so our entire app can access it globally (via prop drilling technically)</w:t>
       </w:r>
     </w:p>
     <w:p/>
@@ -120,29 +68,8 @@
           <w:numId w:val="3"/>
         </w:numPr>
       </w:pPr>
-      <w:proofErr w:type="spellStart"/>
-      <w:r>
-        <w:t>AxiosInterceptorHandler</w:t>
-      </w:r>
-      <w:proofErr w:type="spellEnd"/>
-      <w:r>
-        <w:t xml:space="preserve"> uses </w:t>
-      </w:r>
-      <w:proofErr w:type="spellStart"/>
-      <w:r>
-        <w:t>AuthProvider</w:t>
-      </w:r>
-      <w:proofErr w:type="spellEnd"/>
-      <w:r>
-        <w:t xml:space="preserve"> to set login status and handle if we’re </w:t>
-      </w:r>
-      <w:proofErr w:type="spellStart"/>
-      <w:r>
-        <w:t>authed</w:t>
-      </w:r>
-      <w:proofErr w:type="spellEnd"/>
-      <w:r>
-        <w:t xml:space="preserve"> or not. It handles all logic involving JWT tokens when calling something. </w:t>
+      <w:r>
+        <w:t xml:space="preserve">AxiosInterceptorHandler uses AuthProvider to set login status and handle if we’re authed or not. It handles all logic involving JWT tokens when calling something. </w:t>
       </w:r>
     </w:p>
     <w:p>
@@ -165,13 +92,8 @@
           <w:numId w:val="3"/>
         </w:numPr>
       </w:pPr>
-      <w:proofErr w:type="spellStart"/>
-      <w:r>
-        <w:t>authInstance</w:t>
-      </w:r>
-      <w:proofErr w:type="spellEnd"/>
-      <w:r>
-        <w:t xml:space="preserve"> handles edge case for our initial login logic so we can get/set our tokens and whatnot</w:t>
+      <w:r>
+        <w:t>authInstance handles edge case for our initial login logic so we can get/set our tokens and whatnot</w:t>
       </w:r>
     </w:p>
     <w:p/>
@@ -196,31 +118,7 @@
         </w:numPr>
       </w:pPr>
       <w:r>
-        <w:t xml:space="preserve">Backend follows a controller/service/route architecture. The route calls the controller, which handles the input </w:t>
-      </w:r>
-      <w:proofErr w:type="spellStart"/>
-      <w:r>
-        <w:t>json</w:t>
-      </w:r>
-      <w:proofErr w:type="spellEnd"/>
-      <w:r>
-        <w:t xml:space="preserve"> data and makes sure certain fields that are required are present. The controller then calls the service which </w:t>
-      </w:r>
-      <w:proofErr w:type="gramStart"/>
-      <w:r>
-        <w:t>is in charge of</w:t>
-      </w:r>
-      <w:proofErr w:type="gramEnd"/>
-      <w:r>
-        <w:t xml:space="preserve"> </w:t>
-      </w:r>
-      <w:proofErr w:type="gramStart"/>
-      <w:r>
-        <w:t>actually making</w:t>
-      </w:r>
-      <w:proofErr w:type="gramEnd"/>
-      <w:r>
-        <w:t xml:space="preserve"> the database calls and the processing logic. This </w:t>
+        <w:t xml:space="preserve">Backend follows a controller/service/route architecture. The route calls the controller, which handles the input json data and makes sure certain fields that are required are present. The controller then calls the service which is in charge of actually making the database calls and the processing logic. This </w:t>
       </w:r>
       <w:r>
         <w:lastRenderedPageBreak/>
@@ -295,31 +193,7 @@
         <w:t>Expo Router Navigation</w:t>
       </w:r>
       <w:r>
-        <w:t xml:space="preserve"> starts in app/_</w:t>
-      </w:r>
-      <w:proofErr w:type="spellStart"/>
-      <w:r>
-        <w:t>layout.tsx</w:t>
-      </w:r>
-      <w:proofErr w:type="spellEnd"/>
-      <w:r>
-        <w:t xml:space="preserve"> and renders login. If user is valid (checked in login page via above </w:t>
-      </w:r>
-      <w:proofErr w:type="spellStart"/>
-      <w:r>
-        <w:t>authProvider</w:t>
-      </w:r>
-      <w:proofErr w:type="spellEnd"/>
-      <w:r>
-        <w:t xml:space="preserve">), we navigate to app/(protected)/_layout. By </w:t>
-      </w:r>
-      <w:proofErr w:type="gramStart"/>
-      <w:r>
-        <w:t>default</w:t>
-      </w:r>
-      <w:proofErr w:type="gramEnd"/>
-      <w:r>
-        <w:t xml:space="preserve"> it renders the Home page.</w:t>
+        <w:t xml:space="preserve"> starts in app/_layout.tsx and renders login. If user is valid (checked in login page via above authProvider), we navigate to app/(protected)/_layout. By default it renders the Home page.</w:t>
       </w:r>
     </w:p>
     <w:p>
@@ -515,52 +389,34 @@
       <w:r>
         <w:t xml:space="preserve">Created an </w:t>
       </w:r>
-      <w:proofErr w:type="spellStart"/>
       <w:r>
         <w:rPr>
           <w:b/>
           <w:bCs/>
         </w:rPr>
-        <w:t>AuthProvider</w:t>
-      </w:r>
-      <w:proofErr w:type="spellEnd"/>
+        <w:t>AuthProvider (Auth Context)</w:t>
+      </w:r>
+      <w:r>
+        <w:t xml:space="preserve"> to manage global authentication state.</w:t>
+      </w:r>
+    </w:p>
+    <w:p>
+      <w:pPr>
+        <w:numPr>
+          <w:ilvl w:val="1"/>
+          <w:numId w:val="1"/>
+        </w:numPr>
+      </w:pPr>
+      <w:r>
+        <w:t xml:space="preserve">Integrated </w:t>
+      </w:r>
       <w:r>
         <w:rPr>
           <w:b/>
           <w:bCs/>
         </w:rPr>
-        <w:t xml:space="preserve"> (Auth Context)</w:t>
-      </w:r>
-      <w:r>
-        <w:t xml:space="preserve"> to manage global authentication state.</w:t>
-      </w:r>
-    </w:p>
-    <w:p>
-      <w:pPr>
-        <w:numPr>
-          <w:ilvl w:val="1"/>
-          <w:numId w:val="1"/>
-        </w:numPr>
-      </w:pPr>
-      <w:r>
-        <w:t xml:space="preserve">Integrated </w:t>
-      </w:r>
-      <w:r>
-        <w:rPr>
-          <w:b/>
-          <w:bCs/>
-        </w:rPr>
-        <w:t xml:space="preserve">Expo </w:t>
-      </w:r>
-      <w:proofErr w:type="spellStart"/>
-      <w:r>
-        <w:rPr>
-          <w:b/>
-          <w:bCs/>
-        </w:rPr>
-        <w:t>SecureStore</w:t>
-      </w:r>
-      <w:proofErr w:type="spellEnd"/>
+        <w:t>Expo SecureStore</w:t>
+      </w:r>
       <w:r>
         <w:t xml:space="preserve"> for secure storage of access and refresh tokens.</w:t>
       </w:r>
@@ -615,15 +471,7 @@
         <w:t>route protection</w:t>
       </w:r>
       <w:r>
-        <w:t xml:space="preserve"> based on authentication state (</w:t>
-      </w:r>
-      <w:proofErr w:type="spellStart"/>
-      <w:r>
-        <w:t>isValidUser</w:t>
-      </w:r>
-      <w:proofErr w:type="spellEnd"/>
-      <w:r>
-        <w:t>).</w:t>
+        <w:t xml:space="preserve"> based on authentication state (isValidUser).</w:t>
       </w:r>
     </w:p>
     <w:p>
@@ -696,15 +544,7 @@
         <w:t>JWT authentication logic</w:t>
       </w:r>
       <w:r>
-        <w:t xml:space="preserve"> on the </w:t>
-      </w:r>
-      <w:proofErr w:type="gramStart"/>
-      <w:r>
-        <w:t>frontend</w:t>
-      </w:r>
-      <w:proofErr w:type="gramEnd"/>
-      <w:r>
-        <w:t>.</w:t>
+        <w:t xml:space="preserve"> on the frontend.</w:t>
       </w:r>
     </w:p>
     <w:p>
@@ -736,15 +576,7 @@
         </w:numPr>
       </w:pPr>
       <w:r>
-        <w:t xml:space="preserve">Automatically attaching </w:t>
-      </w:r>
-      <w:proofErr w:type="gramStart"/>
-      <w:r>
-        <w:t>access</w:t>
-      </w:r>
-      <w:proofErr w:type="gramEnd"/>
-      <w:r>
-        <w:t xml:space="preserve"> tokens to requests.</w:t>
+        <w:t>Automatically attaching access tokens to requests.</w:t>
       </w:r>
     </w:p>
     <w:p>
@@ -770,6 +602,140 @@
       </w:r>
       <w:r>
         <w:t>)</w:t>
+      </w:r>
+    </w:p>
+    <w:p>
+      <w:pPr>
+        <w:pStyle w:val="ListParagraph"/>
+        <w:numPr>
+          <w:ilvl w:val="0"/>
+          <w:numId w:val="4"/>
+        </w:numPr>
+      </w:pPr>
+      <w:r>
+        <w:t>Forgot to log so will include with recent week</w:t>
+      </w:r>
+    </w:p>
+    <w:p>
+      <w:pPr>
+        <w:pStyle w:val="Heading1"/>
+      </w:pPr>
+      <w:r>
+        <w:t xml:space="preserve">Progress Summary (Week of </w:t>
+      </w:r>
+      <w:r>
+        <w:t>1</w:t>
+      </w:r>
+      <w:r>
+        <w:t>/</w:t>
+      </w:r>
+      <w:r>
+        <w:t>15/26</w:t>
+      </w:r>
+      <w:r>
+        <w:t>)</w:t>
+      </w:r>
+    </w:p>
+    <w:p>
+      <w:pPr>
+        <w:pStyle w:val="ListParagraph"/>
+        <w:numPr>
+          <w:ilvl w:val="0"/>
+          <w:numId w:val="4"/>
+        </w:numPr>
+      </w:pPr>
+      <w:r>
+        <w:t>(WIP) Building out workout endpoints on backend</w:t>
+      </w:r>
+    </w:p>
+    <w:p>
+      <w:pPr>
+        <w:pStyle w:val="ListParagraph"/>
+        <w:numPr>
+          <w:ilvl w:val="0"/>
+          <w:numId w:val="4"/>
+        </w:numPr>
+      </w:pPr>
+      <w:r>
+        <w:t>Added basic error centralized handling</w:t>
+      </w:r>
+    </w:p>
+    <w:p>
+      <w:pPr>
+        <w:pStyle w:val="ListParagraph"/>
+        <w:numPr>
+          <w:ilvl w:val="0"/>
+          <w:numId w:val="4"/>
+        </w:numPr>
+      </w:pPr>
+      <w:r>
+        <w:t>Full JWT auth flow on frontend with axios</w:t>
+      </w:r>
+    </w:p>
+    <w:p>
+      <w:r>
+        <w:lastRenderedPageBreak/>
+        <w:pict w14:anchorId="18DD88CE">
+          <v:rect id="_x0000_i1026" style="width:0;height:1.5pt" o:hralign="center" o:hrstd="t" o:hr="t" fillcolor="#a0a0a0" stroked="f"/>
+        </w:pict>
+      </w:r>
+    </w:p>
+    <w:p>
+      <w:pPr>
+        <w:rPr>
+          <w:b/>
+          <w:bCs/>
+        </w:rPr>
+      </w:pPr>
+      <w:r>
+        <w:rPr>
+          <w:b/>
+          <w:bCs/>
+        </w:rPr>
+        <w:t>Next Steps</w:t>
+      </w:r>
+      <w:r>
+        <w:rPr>
+          <w:b/>
+          <w:bCs/>
+        </w:rPr>
+        <w:t>:</w:t>
+      </w:r>
+    </w:p>
+    <w:p>
+      <w:pPr>
+        <w:pStyle w:val="ListParagraph"/>
+        <w:numPr>
+          <w:ilvl w:val="0"/>
+          <w:numId w:val="5"/>
+        </w:numPr>
+      </w:pPr>
+      <w:r>
+        <w:t>Build error handler middlewear so don’t repeat as much code</w:t>
+      </w:r>
+    </w:p>
+    <w:p>
+      <w:pPr>
+        <w:pStyle w:val="ListParagraph"/>
+        <w:numPr>
+          <w:ilvl w:val="0"/>
+          <w:numId w:val="5"/>
+        </w:numPr>
+      </w:pPr>
+      <w:r>
+        <w:t>Continue building out/fixing workout endpoints</w:t>
+      </w:r>
+    </w:p>
+    <w:p>
+      <w:pPr>
+        <w:pStyle w:val="ListParagraph"/>
+        <w:numPr>
+          <w:ilvl w:val="0"/>
+          <w:numId w:val="5"/>
+        </w:numPr>
+      </w:pPr>
+      <w:r>
+        <w:t>Add testing so going forward can do test driven development with endpoints &amp; database results –unsure how at this point..</w:t>
       </w:r>
     </w:p>
     <w:p/>
@@ -1172,6 +1138,232 @@
       </w:rPr>
     </w:lvl>
   </w:abstractNum>
+  <w:abstractNum w:abstractNumId="3" w15:restartNumberingAfterBreak="0">
+    <w:nsid w:val="5F39559E"/>
+    <w:multiLevelType w:val="hybridMultilevel"/>
+    <w:tmpl w:val="A86A7F70"/>
+    <w:lvl w:ilvl="0" w:tplc="04090001">
+      <w:start w:val="1"/>
+      <w:numFmt w:val="bullet"/>
+      <w:lvlText w:val=""/>
+      <w:lvlJc w:val="left"/>
+      <w:pPr>
+        <w:ind w:left="720" w:hanging="360"/>
+      </w:pPr>
+      <w:rPr>
+        <w:rFonts w:ascii="Symbol" w:hAnsi="Symbol" w:hint="default"/>
+      </w:rPr>
+    </w:lvl>
+    <w:lvl w:ilvl="1" w:tplc="04090003" w:tentative="1">
+      <w:start w:val="1"/>
+      <w:numFmt w:val="bullet"/>
+      <w:lvlText w:val="o"/>
+      <w:lvlJc w:val="left"/>
+      <w:pPr>
+        <w:ind w:left="1440" w:hanging="360"/>
+      </w:pPr>
+      <w:rPr>
+        <w:rFonts w:ascii="Courier New" w:hAnsi="Courier New" w:cs="Courier New" w:hint="default"/>
+      </w:rPr>
+    </w:lvl>
+    <w:lvl w:ilvl="2" w:tplc="04090005" w:tentative="1">
+      <w:start w:val="1"/>
+      <w:numFmt w:val="bullet"/>
+      <w:lvlText w:val=""/>
+      <w:lvlJc w:val="left"/>
+      <w:pPr>
+        <w:ind w:left="2160" w:hanging="360"/>
+      </w:pPr>
+      <w:rPr>
+        <w:rFonts w:ascii="Wingdings" w:hAnsi="Wingdings" w:hint="default"/>
+      </w:rPr>
+    </w:lvl>
+    <w:lvl w:ilvl="3" w:tplc="04090001" w:tentative="1">
+      <w:start w:val="1"/>
+      <w:numFmt w:val="bullet"/>
+      <w:lvlText w:val=""/>
+      <w:lvlJc w:val="left"/>
+      <w:pPr>
+        <w:ind w:left="2880" w:hanging="360"/>
+      </w:pPr>
+      <w:rPr>
+        <w:rFonts w:ascii="Symbol" w:hAnsi="Symbol" w:hint="default"/>
+      </w:rPr>
+    </w:lvl>
+    <w:lvl w:ilvl="4" w:tplc="04090003" w:tentative="1">
+      <w:start w:val="1"/>
+      <w:numFmt w:val="bullet"/>
+      <w:lvlText w:val="o"/>
+      <w:lvlJc w:val="left"/>
+      <w:pPr>
+        <w:ind w:left="3600" w:hanging="360"/>
+      </w:pPr>
+      <w:rPr>
+        <w:rFonts w:ascii="Courier New" w:hAnsi="Courier New" w:cs="Courier New" w:hint="default"/>
+      </w:rPr>
+    </w:lvl>
+    <w:lvl w:ilvl="5" w:tplc="04090005" w:tentative="1">
+      <w:start w:val="1"/>
+      <w:numFmt w:val="bullet"/>
+      <w:lvlText w:val=""/>
+      <w:lvlJc w:val="left"/>
+      <w:pPr>
+        <w:ind w:left="4320" w:hanging="360"/>
+      </w:pPr>
+      <w:rPr>
+        <w:rFonts w:ascii="Wingdings" w:hAnsi="Wingdings" w:hint="default"/>
+      </w:rPr>
+    </w:lvl>
+    <w:lvl w:ilvl="6" w:tplc="04090001" w:tentative="1">
+      <w:start w:val="1"/>
+      <w:numFmt w:val="bullet"/>
+      <w:lvlText w:val=""/>
+      <w:lvlJc w:val="left"/>
+      <w:pPr>
+        <w:ind w:left="5040" w:hanging="360"/>
+      </w:pPr>
+      <w:rPr>
+        <w:rFonts w:ascii="Symbol" w:hAnsi="Symbol" w:hint="default"/>
+      </w:rPr>
+    </w:lvl>
+    <w:lvl w:ilvl="7" w:tplc="04090003" w:tentative="1">
+      <w:start w:val="1"/>
+      <w:numFmt w:val="bullet"/>
+      <w:lvlText w:val="o"/>
+      <w:lvlJc w:val="left"/>
+      <w:pPr>
+        <w:ind w:left="5760" w:hanging="360"/>
+      </w:pPr>
+      <w:rPr>
+        <w:rFonts w:ascii="Courier New" w:hAnsi="Courier New" w:cs="Courier New" w:hint="default"/>
+      </w:rPr>
+    </w:lvl>
+    <w:lvl w:ilvl="8" w:tplc="04090005" w:tentative="1">
+      <w:start w:val="1"/>
+      <w:numFmt w:val="bullet"/>
+      <w:lvlText w:val=""/>
+      <w:lvlJc w:val="left"/>
+      <w:pPr>
+        <w:ind w:left="6480" w:hanging="360"/>
+      </w:pPr>
+      <w:rPr>
+        <w:rFonts w:ascii="Wingdings" w:hAnsi="Wingdings" w:hint="default"/>
+      </w:rPr>
+    </w:lvl>
+  </w:abstractNum>
+  <w:abstractNum w:abstractNumId="4" w15:restartNumberingAfterBreak="0">
+    <w:nsid w:val="6A115E3C"/>
+    <w:multiLevelType w:val="hybridMultilevel"/>
+    <w:tmpl w:val="E23E2820"/>
+    <w:lvl w:ilvl="0" w:tplc="04090001">
+      <w:start w:val="1"/>
+      <w:numFmt w:val="bullet"/>
+      <w:lvlText w:val=""/>
+      <w:lvlJc w:val="left"/>
+      <w:pPr>
+        <w:ind w:left="720" w:hanging="360"/>
+      </w:pPr>
+      <w:rPr>
+        <w:rFonts w:ascii="Symbol" w:hAnsi="Symbol" w:hint="default"/>
+      </w:rPr>
+    </w:lvl>
+    <w:lvl w:ilvl="1" w:tplc="04090003" w:tentative="1">
+      <w:start w:val="1"/>
+      <w:numFmt w:val="bullet"/>
+      <w:lvlText w:val="o"/>
+      <w:lvlJc w:val="left"/>
+      <w:pPr>
+        <w:ind w:left="1440" w:hanging="360"/>
+      </w:pPr>
+      <w:rPr>
+        <w:rFonts w:ascii="Courier New" w:hAnsi="Courier New" w:cs="Courier New" w:hint="default"/>
+      </w:rPr>
+    </w:lvl>
+    <w:lvl w:ilvl="2" w:tplc="04090005" w:tentative="1">
+      <w:start w:val="1"/>
+      <w:numFmt w:val="bullet"/>
+      <w:lvlText w:val=""/>
+      <w:lvlJc w:val="left"/>
+      <w:pPr>
+        <w:ind w:left="2160" w:hanging="360"/>
+      </w:pPr>
+      <w:rPr>
+        <w:rFonts w:ascii="Wingdings" w:hAnsi="Wingdings" w:hint="default"/>
+      </w:rPr>
+    </w:lvl>
+    <w:lvl w:ilvl="3" w:tplc="04090001" w:tentative="1">
+      <w:start w:val="1"/>
+      <w:numFmt w:val="bullet"/>
+      <w:lvlText w:val=""/>
+      <w:lvlJc w:val="left"/>
+      <w:pPr>
+        <w:ind w:left="2880" w:hanging="360"/>
+      </w:pPr>
+      <w:rPr>
+        <w:rFonts w:ascii="Symbol" w:hAnsi="Symbol" w:hint="default"/>
+      </w:rPr>
+    </w:lvl>
+    <w:lvl w:ilvl="4" w:tplc="04090003" w:tentative="1">
+      <w:start w:val="1"/>
+      <w:numFmt w:val="bullet"/>
+      <w:lvlText w:val="o"/>
+      <w:lvlJc w:val="left"/>
+      <w:pPr>
+        <w:ind w:left="3600" w:hanging="360"/>
+      </w:pPr>
+      <w:rPr>
+        <w:rFonts w:ascii="Courier New" w:hAnsi="Courier New" w:cs="Courier New" w:hint="default"/>
+      </w:rPr>
+    </w:lvl>
+    <w:lvl w:ilvl="5" w:tplc="04090005" w:tentative="1">
+      <w:start w:val="1"/>
+      <w:numFmt w:val="bullet"/>
+      <w:lvlText w:val=""/>
+      <w:lvlJc w:val="left"/>
+      <w:pPr>
+        <w:ind w:left="4320" w:hanging="360"/>
+      </w:pPr>
+      <w:rPr>
+        <w:rFonts w:ascii="Wingdings" w:hAnsi="Wingdings" w:hint="default"/>
+      </w:rPr>
+    </w:lvl>
+    <w:lvl w:ilvl="6" w:tplc="04090001" w:tentative="1">
+      <w:start w:val="1"/>
+      <w:numFmt w:val="bullet"/>
+      <w:lvlText w:val=""/>
+      <w:lvlJc w:val="left"/>
+      <w:pPr>
+        <w:ind w:left="5040" w:hanging="360"/>
+      </w:pPr>
+      <w:rPr>
+        <w:rFonts w:ascii="Symbol" w:hAnsi="Symbol" w:hint="default"/>
+      </w:rPr>
+    </w:lvl>
+    <w:lvl w:ilvl="7" w:tplc="04090003" w:tentative="1">
+      <w:start w:val="1"/>
+      <w:numFmt w:val="bullet"/>
+      <w:lvlText w:val="o"/>
+      <w:lvlJc w:val="left"/>
+      <w:pPr>
+        <w:ind w:left="5760" w:hanging="360"/>
+      </w:pPr>
+      <w:rPr>
+        <w:rFonts w:ascii="Courier New" w:hAnsi="Courier New" w:cs="Courier New" w:hint="default"/>
+      </w:rPr>
+    </w:lvl>
+    <w:lvl w:ilvl="8" w:tplc="04090005" w:tentative="1">
+      <w:start w:val="1"/>
+      <w:numFmt w:val="bullet"/>
+      <w:lvlText w:val=""/>
+      <w:lvlJc w:val="left"/>
+      <w:pPr>
+        <w:ind w:left="6480" w:hanging="360"/>
+      </w:pPr>
+      <w:rPr>
+        <w:rFonts w:ascii="Wingdings" w:hAnsi="Wingdings" w:hint="default"/>
+      </w:rPr>
+    </w:lvl>
+  </w:abstractNum>
   <w:num w:numId="1" w16cid:durableId="1131707575">
     <w:abstractNumId w:val="0"/>
   </w:num>
@@ -1180,6 +1372,12 @@
   </w:num>
   <w:num w:numId="3" w16cid:durableId="507672988">
     <w:abstractNumId w:val="1"/>
+  </w:num>
+  <w:num w:numId="4" w16cid:durableId="746725903">
+    <w:abstractNumId w:val="3"/>
+  </w:num>
+  <w:num w:numId="5" w16cid:durableId="547647594">
+    <w:abstractNumId w:val="4"/>
   </w:num>
 </w:numbering>
 </file>

</xml_diff>

<commit_message>
Setup import script for open food facts import to DB, updated models to work with that. Updated log. Started scaffold for nutrition backend
</commit_message>
<xml_diff>
--- a/ProgressLog.docx
+++ b/ProgressLog.docx
@@ -624,13 +624,7 @@
         <w:t xml:space="preserve">Progress Summary (Week of </w:t>
       </w:r>
       <w:r>
-        <w:t>1</w:t>
-      </w:r>
-      <w:r>
-        <w:t>/</w:t>
-      </w:r>
-      <w:r>
-        <w:t>15/26</w:t>
+        <w:t>1/15/26</w:t>
       </w:r>
       <w:r>
         <w:t>)</w:t>
@@ -738,7 +732,241 @@
         <w:t>Add testing so going forward can do test driven development with endpoints &amp; database results –unsure how at this point..</w:t>
       </w:r>
     </w:p>
-    <w:p/>
+    <w:p>
+      <w:pPr>
+        <w:pStyle w:val="Heading1"/>
+      </w:pPr>
+      <w:r>
+        <w:t>Progress Summary</w:t>
+      </w:r>
+      <w:r>
+        <w:t xml:space="preserve"> (Week of </w:t>
+      </w:r>
+      <w:r>
+        <w:t>4</w:t>
+      </w:r>
+      <w:r>
+        <w:t>/</w:t>
+      </w:r>
+      <w:r>
+        <w:t>2</w:t>
+      </w:r>
+      <w:r>
+        <w:t>)</w:t>
+      </w:r>
+    </w:p>
+    <w:p>
+      <w:r>
+        <w:t xml:space="preserve">Well I’ve done a lot of work since the last update, I forgot to log because I was busy with school. So here is what I’ve </w:t>
+      </w:r>
+      <w:r>
+        <w:t>done</w:t>
+      </w:r>
+      <w:r>
+        <w:t>:</w:t>
+      </w:r>
+    </w:p>
+    <w:p>
+      <w:pPr>
+        <w:pStyle w:val="ListParagraph"/>
+        <w:numPr>
+          <w:ilvl w:val="0"/>
+          <w:numId w:val="6"/>
+        </w:numPr>
+      </w:pPr>
+      <w:r>
+        <w:t>“Finished” workout backend endpoints</w:t>
+      </w:r>
+    </w:p>
+    <w:p>
+      <w:pPr>
+        <w:pStyle w:val="ListParagraph"/>
+        <w:numPr>
+          <w:ilvl w:val="0"/>
+          <w:numId w:val="6"/>
+        </w:numPr>
+      </w:pPr>
+      <w:r>
+        <w:t>Scaffolded some simple frontend displays</w:t>
+      </w:r>
+    </w:p>
+    <w:p>
+      <w:pPr>
+        <w:pStyle w:val="ListParagraph"/>
+        <w:numPr>
+          <w:ilvl w:val="0"/>
+          <w:numId w:val="6"/>
+        </w:numPr>
+      </w:pPr>
+      <w:r>
+        <w:t xml:space="preserve">Used AI to generate me import scripts from the USDA and Open Food Facts databases. </w:t>
+      </w:r>
+      <w:r>
+        <w:rPr>
+          <w:b/>
+          <w:bCs/>
+        </w:rPr>
+        <w:t>I had to upgrade my neon storage</w:t>
+      </w:r>
+      <w:r>
+        <w:t xml:space="preserve"> (and need to re-import)</w:t>
+      </w:r>
+    </w:p>
+    <w:p>
+      <w:r>
+        <w:t xml:space="preserve">It’s really bugging me that I used AI for that though, I don’t think that’s something I could’ve done on my own in 3x that amount of time. I think it best if I slow down, and </w:t>
+      </w:r>
+      <w:r>
+        <w:rPr>
+          <w:b/>
+          <w:bCs/>
+        </w:rPr>
+        <w:t>really</w:t>
+      </w:r>
+      <w:r>
+        <w:t xml:space="preserve"> learn how it was implemented. There’s some cool implementation details Claude explained with streaming and whatnot to handle large amounts of data not clogging up your RAM. </w:t>
+      </w:r>
+      <w:r>
+        <w:t>Definitely worth learning</w:t>
+      </w:r>
+    </w:p>
+    <w:p>
+      <w:r>
+        <w:pict w14:anchorId="27E6CB4C">
+          <v:rect id="_x0000_i1027" style="width:0;height:1.5pt" o:hralign="center" o:hrstd="t" o:hr="t" fillcolor="#a0a0a0" stroked="f"/>
+        </w:pict>
+      </w:r>
+    </w:p>
+    <w:p>
+      <w:pPr>
+        <w:rPr>
+          <w:b/>
+          <w:bCs/>
+        </w:rPr>
+      </w:pPr>
+      <w:r>
+        <w:rPr>
+          <w:b/>
+          <w:bCs/>
+        </w:rPr>
+        <w:t>Next Steps</w:t>
+      </w:r>
+      <w:r>
+        <w:rPr>
+          <w:b/>
+          <w:bCs/>
+        </w:rPr>
+        <w:t>:</w:t>
+      </w:r>
+    </w:p>
+    <w:p>
+      <w:pPr>
+        <w:pStyle w:val="ListParagraph"/>
+        <w:numPr>
+          <w:ilvl w:val="0"/>
+          <w:numId w:val="7"/>
+        </w:numPr>
+      </w:pPr>
+      <w:r>
+        <w:t xml:space="preserve">Build out nutrition logging endpoints </w:t>
+      </w:r>
+    </w:p>
+    <w:p>
+      <w:pPr>
+        <w:pStyle w:val="ListParagraph"/>
+        <w:numPr>
+          <w:ilvl w:val="1"/>
+          <w:numId w:val="7"/>
+        </w:numPr>
+      </w:pPr>
+      <w:r>
+        <w:t>To add new foods/nutrition to the database</w:t>
+      </w:r>
+    </w:p>
+    <w:p>
+      <w:pPr>
+        <w:pStyle w:val="ListParagraph"/>
+        <w:numPr>
+          <w:ilvl w:val="1"/>
+          <w:numId w:val="7"/>
+        </w:numPr>
+      </w:pPr>
+      <w:r>
+        <w:t>Add foods to diary of a user for calorie tracking + macros</w:t>
+      </w:r>
+    </w:p>
+    <w:p>
+      <w:pPr>
+        <w:pStyle w:val="ListParagraph"/>
+        <w:numPr>
+          <w:ilvl w:val="2"/>
+          <w:numId w:val="7"/>
+        </w:numPr>
+      </w:pPr>
+      <w:r>
+        <w:t>Complexities with taking stored data * amount and stuff</w:t>
+      </w:r>
+    </w:p>
+    <w:p>
+      <w:pPr>
+        <w:pStyle w:val="ListParagraph"/>
+        <w:numPr>
+          <w:ilvl w:val="1"/>
+          <w:numId w:val="7"/>
+        </w:numPr>
+      </w:pPr>
+      <w:r>
+        <w:t>Need to add calorie/goals and whatnot for a user</w:t>
+      </w:r>
+    </w:p>
+    <w:p>
+      <w:pPr>
+        <w:pStyle w:val="ListParagraph"/>
+        <w:numPr>
+          <w:ilvl w:val="0"/>
+          <w:numId w:val="7"/>
+        </w:numPr>
+      </w:pPr>
+      <w:r>
+        <w:t>Build out some frontend displays</w:t>
+      </w:r>
+    </w:p>
+    <w:p>
+      <w:pPr>
+        <w:pStyle w:val="ListParagraph"/>
+        <w:numPr>
+          <w:ilvl w:val="1"/>
+          <w:numId w:val="7"/>
+        </w:numPr>
+      </w:pPr>
+      <w:r>
+        <w:t>I really want to make adding new foods super easy</w:t>
+      </w:r>
+    </w:p>
+    <w:p>
+      <w:pPr>
+        <w:pStyle w:val="ListParagraph"/>
+        <w:numPr>
+          <w:ilvl w:val="1"/>
+          <w:numId w:val="7"/>
+        </w:numPr>
+      </w:pPr>
+      <w:r>
+        <w:t>Ideally a picture powered upload and have AI parse nutrition somehow?</w:t>
+      </w:r>
+    </w:p>
+    <w:p>
+      <w:pPr>
+        <w:pStyle w:val="ListParagraph"/>
+        <w:numPr>
+          <w:ilvl w:val="0"/>
+          <w:numId w:val="7"/>
+        </w:numPr>
+      </w:pPr>
+      <w:r>
+        <w:t>Is it possible to create ML pipeline to upload a bunch of nutrition/food data super easily? Or just let user upload pictures and handle it?</w:t>
+      </w:r>
+    </w:p>
     <w:sectPr>
       <w:pgSz w:w="12240" w:h="15840"/>
       <w:pgMar w:top="1440" w:right="1440" w:bottom="1440" w:left="1440" w:header="720" w:footer="720" w:gutter="0"/>
@@ -752,6 +980,119 @@
 <file path=word/numbering.xml><?xml version="1.0" encoding="utf-8"?>
 <w:numbering xmlns:wpc="http://schemas.microsoft.com/office/word/2010/wordprocessingCanvas" xmlns:cx="http://schemas.microsoft.com/office/drawing/2014/chartex" xmlns:cx1="http://schemas.microsoft.com/office/drawing/2015/9/8/chartex" xmlns:cx2="http://schemas.microsoft.com/office/drawing/2015/10/21/chartex" xmlns:cx3="http://schemas.microsoft.com/office/drawing/2016/5/9/chartex" xmlns:cx4="http://schemas.microsoft.com/office/drawing/2016/5/10/chartex" xmlns:cx5="http://schemas.microsoft.com/office/drawing/2016/5/11/chartex" xmlns:cx6="http://schemas.microsoft.com/office/drawing/2016/5/12/chartex" xmlns:cx7="http://schemas.microsoft.com/office/drawing/2016/5/13/chartex" xmlns:cx8="http://schemas.microsoft.com/office/drawing/2016/5/14/chartex" xmlns:mc="http://schemas.openxmlformats.org/markup-compatibility/2006" xmlns:aink="http://schemas.microsoft.com/office/drawing/2016/ink" xmlns:am3d="http://schemas.microsoft.com/office/drawing/2017/model3d" xmlns:o="urn:schemas-microsoft-com:office:office" xmlns:oel="http://schemas.microsoft.com/office/2019/extlst" xmlns:r="http://schemas.openxmlformats.org/officeDocument/2006/relationships" xmlns:m="http://schemas.openxmlformats.org/officeDocument/2006/math" xmlns:v="urn:schemas-microsoft-com:vml" xmlns:wp14="http://schemas.microsoft.com/office/word/2010/wordprocessingDrawing" xmlns:wp="http://schemas.openxmlformats.org/drawingml/2006/wordprocessingDrawing" xmlns:w10="urn:schemas-microsoft-com:office:word" xmlns:w="http://schemas.openxmlformats.org/wordprocessingml/2006/main" xmlns:w14="http://schemas.microsoft.com/office/word/2010/wordml" xmlns:w15="http://schemas.microsoft.com/office/word/2012/wordml" xmlns:w16cex="http://schemas.microsoft.com/office/word/2018/wordml/cex" xmlns:w16cid="http://schemas.microsoft.com/office/word/2016/wordml/cid" xmlns:w16="http://schemas.microsoft.com/office/word/2018/wordml" xmlns:w16du="http://schemas.microsoft.com/office/word/2023/wordml/word16du" xmlns:w16sdtdh="http://schemas.microsoft.com/office/word/2020/wordml/sdtdatahash" xmlns:w16sdtfl="http://schemas.microsoft.com/office/word/2024/wordml/sdtformatlock" xmlns:w16se="http://schemas.microsoft.com/office/word/2015/wordml/symex" xmlns:wpg="http://schemas.microsoft.com/office/word/2010/wordprocessingGroup" xmlns:wpi="http://schemas.microsoft.com/office/word/2010/wordprocessingInk" xmlns:wne="http://schemas.microsoft.com/office/word/2006/wordml" xmlns:wps="http://schemas.microsoft.com/office/word/2010/wordprocessingShape" mc:Ignorable="w14 w15 w16se w16cid w16 w16cex w16sdtdh w16sdtfl w16du wp14">
   <w:abstractNum w:abstractNumId="0" w15:restartNumberingAfterBreak="0">
+    <w:nsid w:val="39EF4D16"/>
+    <w:multiLevelType w:val="hybridMultilevel"/>
+    <w:tmpl w:val="EEA022F4"/>
+    <w:lvl w:ilvl="0" w:tplc="04090001">
+      <w:start w:val="1"/>
+      <w:numFmt w:val="bullet"/>
+      <w:lvlText w:val=""/>
+      <w:lvlJc w:val="left"/>
+      <w:pPr>
+        <w:ind w:left="720" w:hanging="360"/>
+      </w:pPr>
+      <w:rPr>
+        <w:rFonts w:ascii="Symbol" w:hAnsi="Symbol" w:hint="default"/>
+      </w:rPr>
+    </w:lvl>
+    <w:lvl w:ilvl="1" w:tplc="04090003">
+      <w:start w:val="1"/>
+      <w:numFmt w:val="bullet"/>
+      <w:lvlText w:val="o"/>
+      <w:lvlJc w:val="left"/>
+      <w:pPr>
+        <w:ind w:left="1440" w:hanging="360"/>
+      </w:pPr>
+      <w:rPr>
+        <w:rFonts w:ascii="Courier New" w:hAnsi="Courier New" w:cs="Courier New" w:hint="default"/>
+      </w:rPr>
+    </w:lvl>
+    <w:lvl w:ilvl="2" w:tplc="04090005">
+      <w:start w:val="1"/>
+      <w:numFmt w:val="bullet"/>
+      <w:lvlText w:val=""/>
+      <w:lvlJc w:val="left"/>
+      <w:pPr>
+        <w:ind w:left="2160" w:hanging="360"/>
+      </w:pPr>
+      <w:rPr>
+        <w:rFonts w:ascii="Wingdings" w:hAnsi="Wingdings" w:hint="default"/>
+      </w:rPr>
+    </w:lvl>
+    <w:lvl w:ilvl="3" w:tplc="04090001" w:tentative="1">
+      <w:start w:val="1"/>
+      <w:numFmt w:val="bullet"/>
+      <w:lvlText w:val=""/>
+      <w:lvlJc w:val="left"/>
+      <w:pPr>
+        <w:ind w:left="2880" w:hanging="360"/>
+      </w:pPr>
+      <w:rPr>
+        <w:rFonts w:ascii="Symbol" w:hAnsi="Symbol" w:hint="default"/>
+      </w:rPr>
+    </w:lvl>
+    <w:lvl w:ilvl="4" w:tplc="04090003" w:tentative="1">
+      <w:start w:val="1"/>
+      <w:numFmt w:val="bullet"/>
+      <w:lvlText w:val="o"/>
+      <w:lvlJc w:val="left"/>
+      <w:pPr>
+        <w:ind w:left="3600" w:hanging="360"/>
+      </w:pPr>
+      <w:rPr>
+        <w:rFonts w:ascii="Courier New" w:hAnsi="Courier New" w:cs="Courier New" w:hint="default"/>
+      </w:rPr>
+    </w:lvl>
+    <w:lvl w:ilvl="5" w:tplc="04090005" w:tentative="1">
+      <w:start w:val="1"/>
+      <w:numFmt w:val="bullet"/>
+      <w:lvlText w:val=""/>
+      <w:lvlJc w:val="left"/>
+      <w:pPr>
+        <w:ind w:left="4320" w:hanging="360"/>
+      </w:pPr>
+      <w:rPr>
+        <w:rFonts w:ascii="Wingdings" w:hAnsi="Wingdings" w:hint="default"/>
+      </w:rPr>
+    </w:lvl>
+    <w:lvl w:ilvl="6" w:tplc="04090001" w:tentative="1">
+      <w:start w:val="1"/>
+      <w:numFmt w:val="bullet"/>
+      <w:lvlText w:val=""/>
+      <w:lvlJc w:val="left"/>
+      <w:pPr>
+        <w:ind w:left="5040" w:hanging="360"/>
+      </w:pPr>
+      <w:rPr>
+        <w:rFonts w:ascii="Symbol" w:hAnsi="Symbol" w:hint="default"/>
+      </w:rPr>
+    </w:lvl>
+    <w:lvl w:ilvl="7" w:tplc="04090003" w:tentative="1">
+      <w:start w:val="1"/>
+      <w:numFmt w:val="bullet"/>
+      <w:lvlText w:val="o"/>
+      <w:lvlJc w:val="left"/>
+      <w:pPr>
+        <w:ind w:left="5760" w:hanging="360"/>
+      </w:pPr>
+      <w:rPr>
+        <w:rFonts w:ascii="Courier New" w:hAnsi="Courier New" w:cs="Courier New" w:hint="default"/>
+      </w:rPr>
+    </w:lvl>
+    <w:lvl w:ilvl="8" w:tplc="04090005" w:tentative="1">
+      <w:start w:val="1"/>
+      <w:numFmt w:val="bullet"/>
+      <w:lvlText w:val=""/>
+      <w:lvlJc w:val="left"/>
+      <w:pPr>
+        <w:ind w:left="6480" w:hanging="360"/>
+      </w:pPr>
+      <w:rPr>
+        <w:rFonts w:ascii="Wingdings" w:hAnsi="Wingdings" w:hint="default"/>
+      </w:rPr>
+    </w:lvl>
+  </w:abstractNum>
+  <w:abstractNum w:abstractNumId="1" w15:restartNumberingAfterBreak="0">
     <w:nsid w:val="40F11AAB"/>
     <w:multiLevelType w:val="multilevel"/>
     <w:tmpl w:val="8E1AEE66"/>
@@ -900,7 +1241,7 @@
       </w:rPr>
     </w:lvl>
   </w:abstractNum>
-  <w:abstractNum w:abstractNumId="1" w15:restartNumberingAfterBreak="0">
+  <w:abstractNum w:abstractNumId="2" w15:restartNumberingAfterBreak="0">
     <w:nsid w:val="440D7012"/>
     <w:multiLevelType w:val="hybridMultilevel"/>
     <w:tmpl w:val="55201B98"/>
@@ -989,7 +1330,120 @@
       </w:pPr>
     </w:lvl>
   </w:abstractNum>
-  <w:abstractNum w:abstractNumId="2" w15:restartNumberingAfterBreak="0">
+  <w:abstractNum w:abstractNumId="3" w15:restartNumberingAfterBreak="0">
+    <w:nsid w:val="4F315D6B"/>
+    <w:multiLevelType w:val="hybridMultilevel"/>
+    <w:tmpl w:val="57082B62"/>
+    <w:lvl w:ilvl="0" w:tplc="04090001">
+      <w:start w:val="1"/>
+      <w:numFmt w:val="bullet"/>
+      <w:lvlText w:val=""/>
+      <w:lvlJc w:val="left"/>
+      <w:pPr>
+        <w:ind w:left="720" w:hanging="360"/>
+      </w:pPr>
+      <w:rPr>
+        <w:rFonts w:ascii="Symbol" w:hAnsi="Symbol" w:hint="default"/>
+      </w:rPr>
+    </w:lvl>
+    <w:lvl w:ilvl="1" w:tplc="04090003" w:tentative="1">
+      <w:start w:val="1"/>
+      <w:numFmt w:val="bullet"/>
+      <w:lvlText w:val="o"/>
+      <w:lvlJc w:val="left"/>
+      <w:pPr>
+        <w:ind w:left="1440" w:hanging="360"/>
+      </w:pPr>
+      <w:rPr>
+        <w:rFonts w:ascii="Courier New" w:hAnsi="Courier New" w:cs="Courier New" w:hint="default"/>
+      </w:rPr>
+    </w:lvl>
+    <w:lvl w:ilvl="2" w:tplc="04090005" w:tentative="1">
+      <w:start w:val="1"/>
+      <w:numFmt w:val="bullet"/>
+      <w:lvlText w:val=""/>
+      <w:lvlJc w:val="left"/>
+      <w:pPr>
+        <w:ind w:left="2160" w:hanging="360"/>
+      </w:pPr>
+      <w:rPr>
+        <w:rFonts w:ascii="Wingdings" w:hAnsi="Wingdings" w:hint="default"/>
+      </w:rPr>
+    </w:lvl>
+    <w:lvl w:ilvl="3" w:tplc="04090001" w:tentative="1">
+      <w:start w:val="1"/>
+      <w:numFmt w:val="bullet"/>
+      <w:lvlText w:val=""/>
+      <w:lvlJc w:val="left"/>
+      <w:pPr>
+        <w:ind w:left="2880" w:hanging="360"/>
+      </w:pPr>
+      <w:rPr>
+        <w:rFonts w:ascii="Symbol" w:hAnsi="Symbol" w:hint="default"/>
+      </w:rPr>
+    </w:lvl>
+    <w:lvl w:ilvl="4" w:tplc="04090003" w:tentative="1">
+      <w:start w:val="1"/>
+      <w:numFmt w:val="bullet"/>
+      <w:lvlText w:val="o"/>
+      <w:lvlJc w:val="left"/>
+      <w:pPr>
+        <w:ind w:left="3600" w:hanging="360"/>
+      </w:pPr>
+      <w:rPr>
+        <w:rFonts w:ascii="Courier New" w:hAnsi="Courier New" w:cs="Courier New" w:hint="default"/>
+      </w:rPr>
+    </w:lvl>
+    <w:lvl w:ilvl="5" w:tplc="04090005" w:tentative="1">
+      <w:start w:val="1"/>
+      <w:numFmt w:val="bullet"/>
+      <w:lvlText w:val=""/>
+      <w:lvlJc w:val="left"/>
+      <w:pPr>
+        <w:ind w:left="4320" w:hanging="360"/>
+      </w:pPr>
+      <w:rPr>
+        <w:rFonts w:ascii="Wingdings" w:hAnsi="Wingdings" w:hint="default"/>
+      </w:rPr>
+    </w:lvl>
+    <w:lvl w:ilvl="6" w:tplc="04090001" w:tentative="1">
+      <w:start w:val="1"/>
+      <w:numFmt w:val="bullet"/>
+      <w:lvlText w:val=""/>
+      <w:lvlJc w:val="left"/>
+      <w:pPr>
+        <w:ind w:left="5040" w:hanging="360"/>
+      </w:pPr>
+      <w:rPr>
+        <w:rFonts w:ascii="Symbol" w:hAnsi="Symbol" w:hint="default"/>
+      </w:rPr>
+    </w:lvl>
+    <w:lvl w:ilvl="7" w:tplc="04090003" w:tentative="1">
+      <w:start w:val="1"/>
+      <w:numFmt w:val="bullet"/>
+      <w:lvlText w:val="o"/>
+      <w:lvlJc w:val="left"/>
+      <w:pPr>
+        <w:ind w:left="5760" w:hanging="360"/>
+      </w:pPr>
+      <w:rPr>
+        <w:rFonts w:ascii="Courier New" w:hAnsi="Courier New" w:cs="Courier New" w:hint="default"/>
+      </w:rPr>
+    </w:lvl>
+    <w:lvl w:ilvl="8" w:tplc="04090005" w:tentative="1">
+      <w:start w:val="1"/>
+      <w:numFmt w:val="bullet"/>
+      <w:lvlText w:val=""/>
+      <w:lvlJc w:val="left"/>
+      <w:pPr>
+        <w:ind w:left="6480" w:hanging="360"/>
+      </w:pPr>
+      <w:rPr>
+        <w:rFonts w:ascii="Wingdings" w:hAnsi="Wingdings" w:hint="default"/>
+      </w:rPr>
+    </w:lvl>
+  </w:abstractNum>
+  <w:abstractNum w:abstractNumId="4" w15:restartNumberingAfterBreak="0">
     <w:nsid w:val="568618D2"/>
     <w:multiLevelType w:val="multilevel"/>
     <w:tmpl w:val="BB82E000"/>
@@ -1138,7 +1592,7 @@
       </w:rPr>
     </w:lvl>
   </w:abstractNum>
-  <w:abstractNum w:abstractNumId="3" w15:restartNumberingAfterBreak="0">
+  <w:abstractNum w:abstractNumId="5" w15:restartNumberingAfterBreak="0">
     <w:nsid w:val="5F39559E"/>
     <w:multiLevelType w:val="hybridMultilevel"/>
     <w:tmpl w:val="A86A7F70"/>
@@ -1251,7 +1705,7 @@
       </w:rPr>
     </w:lvl>
   </w:abstractNum>
-  <w:abstractNum w:abstractNumId="4" w15:restartNumberingAfterBreak="0">
+  <w:abstractNum w:abstractNumId="6" w15:restartNumberingAfterBreak="0">
     <w:nsid w:val="6A115E3C"/>
     <w:multiLevelType w:val="hybridMultilevel"/>
     <w:tmpl w:val="E23E2820"/>
@@ -1365,19 +1819,25 @@
     </w:lvl>
   </w:abstractNum>
   <w:num w:numId="1" w16cid:durableId="1131707575">
-    <w:abstractNumId w:val="0"/>
+    <w:abstractNumId w:val="1"/>
   </w:num>
   <w:num w:numId="2" w16cid:durableId="1879198491">
+    <w:abstractNumId w:val="4"/>
+  </w:num>
+  <w:num w:numId="3" w16cid:durableId="507672988">
     <w:abstractNumId w:val="2"/>
   </w:num>
-  <w:num w:numId="3" w16cid:durableId="507672988">
-    <w:abstractNumId w:val="1"/>
+  <w:num w:numId="4" w16cid:durableId="746725903">
+    <w:abstractNumId w:val="5"/>
   </w:num>
-  <w:num w:numId="4" w16cid:durableId="746725903">
+  <w:num w:numId="5" w16cid:durableId="547647594">
+    <w:abstractNumId w:val="6"/>
+  </w:num>
+  <w:num w:numId="6" w16cid:durableId="297535870">
     <w:abstractNumId w:val="3"/>
   </w:num>
-  <w:num w:numId="5" w16cid:durableId="547647594">
-    <w:abstractNumId w:val="4"/>
+  <w:num w:numId="7" w16cid:durableId="1682901460">
+    <w:abstractNumId w:val="0"/>
   </w:num>
 </w:numbering>
 </file>

</xml_diff>

<commit_message>
fix: validate stored auth token on app startup, fix recipe test assertions
AuthProvider now checks the stored token against /auth/validToken on
mount instead of only tracking an in-memory boolean, with a loading
state gating _layout/index routing until the check resolves. Removes
the now-duplicate check from login.tsx.

Also fixes nutrition.test.js's Create Recipe test, which asserted a
bogus double-nested result.recipe.recipe_id / result.ingredients shape
that didn't match the actual API response, breaking createdRecipeId
and cascading into every later recipe test.

Co-Authored-By: Claude Sonnet 5 <noreply@anthropic.com>
</commit_message>
<xml_diff>
--- a/ProgressLog.docx
+++ b/ProgressLog.docx
@@ -32,7 +32,15 @@
         <w:pStyle w:val="Heading1"/>
       </w:pPr>
       <w:r>
-        <w:t>Notes on how this works, since its been a while</w:t>
+        <w:t xml:space="preserve">Notes on how this works, since </w:t>
+      </w:r>
+      <w:proofErr w:type="spellStart"/>
+      <w:r>
+        <w:t>its</w:t>
+      </w:r>
+      <w:proofErr w:type="spellEnd"/>
+      <w:r>
+        <w:t xml:space="preserve"> been a while</w:t>
       </w:r>
     </w:p>
     <w:p>
@@ -44,8 +52,21 @@
         </w:numPr>
       </w:pPr>
       <w:r>
-        <w:t>All frontend logic auth is handled via utils/AuthProvider and utils/AxiosInterceptorHandler</w:t>
-      </w:r>
+        <w:t>All frontend logic auth is handled via utils/</w:t>
+      </w:r>
+      <w:proofErr w:type="spellStart"/>
+      <w:r>
+        <w:t>AuthProvider</w:t>
+      </w:r>
+      <w:proofErr w:type="spellEnd"/>
+      <w:r>
+        <w:t xml:space="preserve"> and utils/</w:t>
+      </w:r>
+      <w:proofErr w:type="spellStart"/>
+      <w:r>
+        <w:t>AxiosInterceptorHandler</w:t>
+      </w:r>
+      <w:proofErr w:type="spellEnd"/>
     </w:p>
     <w:p>
       <w:pPr>
@@ -55,8 +76,21 @@
           <w:numId w:val="3"/>
         </w:numPr>
       </w:pPr>
-      <w:r>
-        <w:t>AuthProvider wraps our entire app and returns loggedIn state value prop so our entire app can access it globally (via prop drilling technically)</w:t>
+      <w:proofErr w:type="spellStart"/>
+      <w:r>
+        <w:t>AuthProvider</w:t>
+      </w:r>
+      <w:proofErr w:type="spellEnd"/>
+      <w:r>
+        <w:t xml:space="preserve"> wraps our entire app and returns </w:t>
+      </w:r>
+      <w:proofErr w:type="spellStart"/>
+      <w:r>
+        <w:t>loggedIn</w:t>
+      </w:r>
+      <w:proofErr w:type="spellEnd"/>
+      <w:r>
+        <w:t xml:space="preserve"> state value prop so our entire app can access it globally (via prop drilling technically)</w:t>
       </w:r>
     </w:p>
     <w:p/>
@@ -68,8 +102,29 @@
           <w:numId w:val="3"/>
         </w:numPr>
       </w:pPr>
-      <w:r>
-        <w:t xml:space="preserve">AxiosInterceptorHandler uses AuthProvider to set login status and handle if we’re authed or not. It handles all logic involving JWT tokens when calling something. </w:t>
+      <w:proofErr w:type="spellStart"/>
+      <w:r>
+        <w:t>AxiosInterceptorHandler</w:t>
+      </w:r>
+      <w:proofErr w:type="spellEnd"/>
+      <w:r>
+        <w:t xml:space="preserve"> uses </w:t>
+      </w:r>
+      <w:proofErr w:type="spellStart"/>
+      <w:r>
+        <w:t>AuthProvider</w:t>
+      </w:r>
+      <w:proofErr w:type="spellEnd"/>
+      <w:r>
+        <w:t xml:space="preserve"> to set login status and handle if we’re </w:t>
+      </w:r>
+      <w:proofErr w:type="spellStart"/>
+      <w:r>
+        <w:t>authed</w:t>
+      </w:r>
+      <w:proofErr w:type="spellEnd"/>
+      <w:r>
+        <w:t xml:space="preserve"> or not. It handles all logic involving JWT tokens when calling something. </w:t>
       </w:r>
     </w:p>
     <w:p>
@@ -92,8 +147,13 @@
           <w:numId w:val="3"/>
         </w:numPr>
       </w:pPr>
-      <w:r>
-        <w:t>authInstance handles edge case for our initial login logic so we can get/set our tokens and whatnot</w:t>
+      <w:proofErr w:type="spellStart"/>
+      <w:r>
+        <w:t>authInstance</w:t>
+      </w:r>
+      <w:proofErr w:type="spellEnd"/>
+      <w:r>
+        <w:t xml:space="preserve"> handles edge case for our initial login logic so we can get/set our tokens and whatnot</w:t>
       </w:r>
     </w:p>
     <w:p/>
@@ -118,7 +178,15 @@
         </w:numPr>
       </w:pPr>
       <w:r>
-        <w:t xml:space="preserve">Backend follows a controller/service/route architecture. The route calls the controller, which handles the input json data and makes sure certain fields that are required are present. The controller then calls the service which is in charge of actually making the database calls and the processing logic. This </w:t>
+        <w:t xml:space="preserve">Backend follows a controller/service/route architecture. The route calls the controller, which handles the input </w:t>
+      </w:r>
+      <w:proofErr w:type="spellStart"/>
+      <w:r>
+        <w:t>json</w:t>
+      </w:r>
+      <w:proofErr w:type="spellEnd"/>
+      <w:r>
+        <w:t xml:space="preserve"> data and makes sure certain fields that are required are present. The controller then calls the service which is in charge of actually making the database calls and the processing logic. This </w:t>
       </w:r>
       <w:r>
         <w:lastRenderedPageBreak/>
@@ -193,7 +261,23 @@
         <w:t>Expo Router Navigation</w:t>
       </w:r>
       <w:r>
-        <w:t xml:space="preserve"> starts in app/_layout.tsx and renders login. If user is valid (checked in login page via above authProvider), we navigate to app/(protected)/_layout. By default it renders the Home page.</w:t>
+        <w:t xml:space="preserve"> starts in app/_</w:t>
+      </w:r>
+      <w:proofErr w:type="spellStart"/>
+      <w:r>
+        <w:t>layout.tsx</w:t>
+      </w:r>
+      <w:proofErr w:type="spellEnd"/>
+      <w:r>
+        <w:t xml:space="preserve"> and renders login. If user is valid (checked in login page via above </w:t>
+      </w:r>
+      <w:proofErr w:type="spellStart"/>
+      <w:r>
+        <w:t>authProvider</w:t>
+      </w:r>
+      <w:proofErr w:type="spellEnd"/>
+      <w:r>
+        <w:t>), we navigate to app/(protected)/_layout. By default it renders the Home page.</w:t>
       </w:r>
     </w:p>
     <w:p>
@@ -389,34 +473,52 @@
       <w:r>
         <w:t xml:space="preserve">Created an </w:t>
       </w:r>
+      <w:proofErr w:type="spellStart"/>
       <w:r>
         <w:rPr>
           <w:b/>
           <w:bCs/>
         </w:rPr>
-        <w:t>AuthProvider (Auth Context)</w:t>
-      </w:r>
-      <w:r>
-        <w:t xml:space="preserve"> to manage global authentication state.</w:t>
-      </w:r>
-    </w:p>
-    <w:p>
-      <w:pPr>
-        <w:numPr>
-          <w:ilvl w:val="1"/>
-          <w:numId w:val="1"/>
-        </w:numPr>
-      </w:pPr>
-      <w:r>
-        <w:t xml:space="preserve">Integrated </w:t>
-      </w:r>
+        <w:t>AuthProvider</w:t>
+      </w:r>
+      <w:proofErr w:type="spellEnd"/>
       <w:r>
         <w:rPr>
           <w:b/>
           <w:bCs/>
         </w:rPr>
-        <w:t>Expo SecureStore</w:t>
-      </w:r>
+        <w:t xml:space="preserve"> (Auth Context)</w:t>
+      </w:r>
+      <w:r>
+        <w:t xml:space="preserve"> to manage global authentication state.</w:t>
+      </w:r>
+    </w:p>
+    <w:p>
+      <w:pPr>
+        <w:numPr>
+          <w:ilvl w:val="1"/>
+          <w:numId w:val="1"/>
+        </w:numPr>
+      </w:pPr>
+      <w:r>
+        <w:t xml:space="preserve">Integrated </w:t>
+      </w:r>
+      <w:r>
+        <w:rPr>
+          <w:b/>
+          <w:bCs/>
+        </w:rPr>
+        <w:t xml:space="preserve">Expo </w:t>
+      </w:r>
+      <w:proofErr w:type="spellStart"/>
+      <w:r>
+        <w:rPr>
+          <w:b/>
+          <w:bCs/>
+        </w:rPr>
+        <w:t>SecureStore</w:t>
+      </w:r>
+      <w:proofErr w:type="spellEnd"/>
       <w:r>
         <w:t xml:space="preserve"> for secure storage of access and refresh tokens.</w:t>
       </w:r>
@@ -471,7 +573,15 @@
         <w:t>route protection</w:t>
       </w:r>
       <w:r>
-        <w:t xml:space="preserve"> based on authentication state (isValidUser).</w:t>
+        <w:t xml:space="preserve"> based on authentication state (</w:t>
+      </w:r>
+      <w:proofErr w:type="spellStart"/>
+      <w:r>
+        <w:t>isValidUser</w:t>
+      </w:r>
+      <w:proofErr w:type="spellEnd"/>
+      <w:r>
+        <w:t>).</w:t>
       </w:r>
     </w:p>
     <w:p>
@@ -663,8 +773,13 @@
         </w:numPr>
       </w:pPr>
       <w:r>
-        <w:t>Full JWT auth flow on frontend with axios</w:t>
-      </w:r>
+        <w:t xml:space="preserve">Full JWT auth flow on frontend with </w:t>
+      </w:r>
+      <w:proofErr w:type="spellStart"/>
+      <w:r>
+        <w:t>axios</w:t>
+      </w:r>
+      <w:proofErr w:type="spellEnd"/>
     </w:p>
     <w:p>
       <w:r>
@@ -705,7 +820,15 @@
         </w:numPr>
       </w:pPr>
       <w:r>
-        <w:t>Build error handler middlewear so don’t repeat as much code</w:t>
+        <w:t xml:space="preserve">Build error handler </w:t>
+      </w:r>
+      <w:proofErr w:type="spellStart"/>
+      <w:r>
+        <w:t>middlewear</w:t>
+      </w:r>
+      <w:proofErr w:type="spellEnd"/>
+      <w:r>
+        <w:t xml:space="preserve"> so don’t repeat as much code</w:t>
       </w:r>
     </w:p>
     <w:p>
@@ -992,7 +1115,39 @@
         </w:numPr>
       </w:pPr>
       <w:r>
-        <w:t>Usual Index’s are B tree index’s. Think of alphabetical B tree sorting so nlogn Index’s in general speed up the reads for certain column (useful for something grabbed often like user_id fk’s and “food” and stuff). But slightly slow down writes since you have to re-index stuff on adding data.</w:t>
+        <w:t xml:space="preserve">Usual </w:t>
+      </w:r>
+      <w:proofErr w:type="spellStart"/>
+      <w:r>
+        <w:t>Index’s</w:t>
+      </w:r>
+      <w:proofErr w:type="spellEnd"/>
+      <w:r>
+        <w:t xml:space="preserve"> are B tree index’s. Think of alphabetical B tree sorting so </w:t>
+      </w:r>
+      <w:proofErr w:type="spellStart"/>
+      <w:r>
+        <w:t>nlogn</w:t>
+      </w:r>
+      <w:proofErr w:type="spellEnd"/>
+      <w:r>
+        <w:t xml:space="preserve"> Index’s in general speed up the reads for certain column (useful for something grabbed often like </w:t>
+      </w:r>
+      <w:proofErr w:type="spellStart"/>
+      <w:r>
+        <w:t>user_id</w:t>
+      </w:r>
+      <w:proofErr w:type="spellEnd"/>
+      <w:r>
+        <w:t xml:space="preserve"> </w:t>
+      </w:r>
+      <w:proofErr w:type="spellStart"/>
+      <w:r>
+        <w:t>fk’s</w:t>
+      </w:r>
+      <w:proofErr w:type="spellEnd"/>
+      <w:r>
+        <w:t xml:space="preserve"> and “food” and stuff). But slightly slow down writes since you have to re-index stuff on adding data.</w:t>
       </w:r>
     </w:p>
     <w:p>
@@ -1004,7 +1159,15 @@
         </w:numPr>
       </w:pPr>
       <w:r>
-        <w:t>Gin index’s were created specifically for better text searching, it groups data into “containers”. Component-&gt;list of rows.</w:t>
+        <w:t xml:space="preserve">Gin </w:t>
+      </w:r>
+      <w:proofErr w:type="spellStart"/>
+      <w:r>
+        <w:t>index’s</w:t>
+      </w:r>
+      <w:proofErr w:type="spellEnd"/>
+      <w:r>
+        <w:t xml:space="preserve"> were created specifically for better text searching, it groups data into “containers”. Component-&gt;list of rows.</w:t>
       </w:r>
     </w:p>
     <w:p>
@@ -1018,6 +1181,7 @@
       <w:r>
         <w:t xml:space="preserve">So we use </w:t>
       </w:r>
+      <w:proofErr w:type="spellStart"/>
       <w:r>
         <w:rPr>
           <w:b/>
@@ -1025,8 +1189,17 @@
         </w:rPr>
         <w:t>tsvector</w:t>
       </w:r>
-      <w:r>
-        <w:t xml:space="preserve"> for breaking words into stems, good for finding whole works and related things. Like “chickeny” is “chicken”. Bad example but yea</w:t>
+      <w:proofErr w:type="spellEnd"/>
+      <w:r>
+        <w:t xml:space="preserve"> for breaking words into stems, good for finding whole works and related things. Like “</w:t>
+      </w:r>
+      <w:proofErr w:type="spellStart"/>
+      <w:r>
+        <w:t>chickeny</w:t>
+      </w:r>
+      <w:proofErr w:type="spellEnd"/>
+      <w:r>
+        <w:t>” is “chicken”. Bad example but yea</w:t>
       </w:r>
     </w:p>
     <w:p>
@@ -1120,6 +1293,58 @@
       </w:r>
       <w:r>
         <w:t>.</w:t>
+      </w:r>
+    </w:p>
+    <w:p/>
+    <w:p/>
+    <w:p>
+      <w:pPr>
+        <w:pStyle w:val="Heading2"/>
+      </w:pPr>
+      <w:r>
+        <w:t>Notes on How everything works + updates thus far</w:t>
+      </w:r>
+    </w:p>
+    <w:p>
+      <w:r>
+        <w:t xml:space="preserve">Well it’s been a long time. I’ve been slacking on this and burnt out and overwhelmed with school and work and expectations. </w:t>
+      </w:r>
+      <w:r>
+        <w:t>Let’s</w:t>
+      </w:r>
+      <w:r>
+        <w:t xml:space="preserve"> recap what we have done, and then go into how it works, patterns, tradeoffs etc. </w:t>
+      </w:r>
+    </w:p>
+    <w:p/>
+    <w:p>
+      <w:pPr>
+        <w:pStyle w:val="Heading3"/>
+      </w:pPr>
+      <w:r>
+        <w:lastRenderedPageBreak/>
+        <w:t>How auth works</w:t>
+      </w:r>
+    </w:p>
+    <w:p>
+      <w:pPr>
+        <w:pStyle w:val="ListParagraph"/>
+        <w:numPr>
+          <w:ilvl w:val="0"/>
+          <w:numId w:val="9"/>
+        </w:numPr>
+      </w:pPr>
+      <w:r>
+        <w:t>Frontend checks if</w:t>
+      </w:r>
+      <w:r>
+        <w:t xml:space="preserve"> our user is valid via our context (auth provider), if it is, </w:t>
+      </w:r>
+      <w:r>
+        <w:t xml:space="preserve">move to dashboard. If not go to login. </w:t>
+      </w:r>
+      <w:r>
+        <w:t xml:space="preserve"> </w:t>
       </w:r>
     </w:p>
     <w:p/>
@@ -1138,7 +1363,7 @@
   <w:abstractNum w:abstractNumId="0" w15:restartNumberingAfterBreak="0">
     <w:nsid w:val="28B86422"/>
     <w:multiLevelType w:val="hybridMultilevel"/>
-    <w:tmpl w:val="6EB809A4"/>
+    <w:tmpl w:val="2A4AC014"/>
     <w:lvl w:ilvl="0" w:tplc="04090001">
       <w:start w:val="1"/>
       <w:numFmt w:val="bullet"/>
@@ -2658,7 +2883,6 @@
     <w:next w:val="Normal"/>
     <w:link w:val="Heading2Char"/>
     <w:uiPriority w:val="9"/>
-    <w:semiHidden/>
     <w:unhideWhenUsed/>
     <w:qFormat/>
     <w:rsid w:val="003F6D6F"/>
@@ -2681,7 +2905,6 @@
     <w:next w:val="Normal"/>
     <w:link w:val="Heading3Char"/>
     <w:uiPriority w:val="9"/>
-    <w:semiHidden/>
     <w:unhideWhenUsed/>
     <w:qFormat/>
     <w:rsid w:val="003F6D6F"/>
@@ -2875,7 +3098,6 @@
     <w:basedOn w:val="DefaultParagraphFont"/>
     <w:link w:val="Heading2"/>
     <w:uiPriority w:val="9"/>
-    <w:semiHidden/>
     <w:rsid w:val="003F6D6F"/>
     <w:rPr>
       <w:rFonts w:asciiTheme="majorHAnsi" w:eastAsiaTheme="majorEastAsia" w:hAnsiTheme="majorHAnsi" w:cstheme="majorBidi"/>
@@ -2889,7 +3111,6 @@
     <w:basedOn w:val="DefaultParagraphFont"/>
     <w:link w:val="Heading3"/>
     <w:uiPriority w:val="9"/>
-    <w:semiHidden/>
     <w:rsid w:val="003F6D6F"/>
     <w:rPr>
       <w:rFonts w:eastAsiaTheme="majorEastAsia" w:cstheme="majorBidi"/>

</xml_diff>